<commit_message>
feat(seed): add V10 authentic Moroccan clinical practice dataset and MinIO vault fixtures
</commit_message>
<xml_diff>
--- a/docs/Dossia_Architecture_Master_Spec.docx
+++ b/docs/Dossia_Architecture_Master_Spec.docx
@@ -3269,6 +3269,111 @@
                 <w:sz w:val="17"/>
               </w:rPr>
               <w:t>Document vault schema: multi-tenant patient_documents table with CNDP visibility tiers (DOCTOR_ONLY vs SHARED_SECRETARY), strict MIME checks (PDF, JPEG, PNG, WEBP), and soft-delete retention.</w:t>
+            </w:r>
+          </w:p>
+        </w:tc>
+      </w:tr>
+      <w:tr>
+        <w:tc>
+          <w:tcPr>
+            <w:tcW w:type="dxa" w:w="2592"/>
+            <w:shd w:fill="F8FAFC"/>
+            <w:tcMar>
+              <w:top w:w="80" w:type="dxa"/>
+              <w:bottom w:w="80" w:type="dxa"/>
+              <w:left w:w="100" w:type="dxa"/>
+              <w:right w:w="100" w:type="dxa"/>
+            </w:tcMar>
+          </w:tcPr>
+          <w:p>
+            <w:pPr>
+              <w:spacing w:after="0" w:line="264" w:lineRule="auto"/>
+            </w:pPr>
+            <w:r>
+              <w:rPr>
+                <w:rFonts w:ascii="Arial" w:hAnsi="Arial"/>
+                <w:b/>
+                <w:color w:val="18181B"/>
+                <w:sz w:val="17"/>
+              </w:rPr>
+              <w:t>V10</w:t>
+              <w:br/>
+              <w:t>V10__seed_moroccan_clinical_practice_data.sql</w:t>
+            </w:r>
+          </w:p>
+        </w:tc>
+        <w:tc>
+          <w:tcPr>
+            <w:tcW w:type="dxa" w:w="2160"/>
+            <w:shd w:fill="F8FAFC"/>
+            <w:tcMar>
+              <w:top w:w="80" w:type="dxa"/>
+              <w:bottom w:w="80" w:type="dxa"/>
+              <w:left w:w="100" w:type="dxa"/>
+              <w:right w:w="100" w:type="dxa"/>
+            </w:tcMar>
+          </w:tcPr>
+          <w:p>
+            <w:pPr>
+              <w:spacing w:after="0" w:line="264" w:lineRule="auto"/>
+            </w:pPr>
+            <w:r>
+              <w:rPr>
+                <w:rFonts w:ascii="Arial" w:hAnsi="Arial"/>
+                <w:color w:val="3F3F46"/>
+                <w:sz w:val="17"/>
+              </w:rPr>
+              <w:t>patients, appointments, consultations, prescriptions, prescription_items, invoices, payments, feuilles_de_soins, diagnostic_requests, medical_certificates, patient_documents</w:t>
+            </w:r>
+          </w:p>
+        </w:tc>
+        <w:tc>
+          <w:tcPr>
+            <w:tcW w:type="dxa" w:w="1440"/>
+            <w:shd w:fill="F8FAFC"/>
+            <w:tcMar>
+              <w:top w:w="80" w:type="dxa"/>
+              <w:bottom w:w="80" w:type="dxa"/>
+              <w:left w:w="100" w:type="dxa"/>
+              <w:right w:w="100" w:type="dxa"/>
+            </w:tcMar>
+          </w:tcPr>
+          <w:p>
+            <w:pPr>
+              <w:spacing w:after="0" w:line="264" w:lineRule="auto"/>
+            </w:pPr>
+            <w:r>
+              <w:rPr>
+                <w:rFonts w:ascii="Arial" w:hAnsi="Arial"/>
+                <w:color w:val="3F3F46"/>
+                <w:sz w:val="17"/>
+              </w:rPr>
+              <w:t>Yes (Clinique Ibn Sina Agadir)</w:t>
+            </w:r>
+          </w:p>
+        </w:tc>
+        <w:tc>
+          <w:tcPr>
+            <w:tcW w:type="dxa" w:w="3168"/>
+            <w:shd w:fill="F8FAFC"/>
+            <w:tcMar>
+              <w:top w:w="80" w:type="dxa"/>
+              <w:bottom w:w="80" w:type="dxa"/>
+              <w:left w:w="100" w:type="dxa"/>
+              <w:right w:w="100" w:type="dxa"/>
+            </w:tcMar>
+          </w:tcPr>
+          <w:p>
+            <w:pPr>
+              <w:spacing w:after="0" w:line="264" w:lineRule="auto"/>
+            </w:pPr>
+            <w:r>
+              <w:rPr>
+                <w:rFonts w:ascii="Arial" w:hAnsi="Arial"/>
+                <w:color w:val="3F3F46"/>
+                <w:sz w:val="17"/>
+              </w:rPr>
+              <w:t>Authentic Moroccan clinical practice seed dataset: 10 patients with valid CIN/phone/CNSS, dynamic waiting-room queue and agenda (relative to CURRENT_DATE), completed consultations, prescriptions, MAD daily caisse transactions, CNSS/CNOPS claim forms, bilans, and document vault records.</w:t>
             </w:r>
           </w:p>
         </w:tc>
@@ -9963,6 +10068,111 @@
           </w:p>
         </w:tc>
       </w:tr>
+      <w:tr>
+        <w:tc>
+          <w:tcPr>
+            <w:tcW w:type="dxa" w:w="2592"/>
+            <w:shd w:fill="FFFFFF"/>
+            <w:tcMar>
+              <w:top w:w="90" w:type="dxa"/>
+              <w:bottom w:w="90" w:type="dxa"/>
+              <w:left w:w="120" w:type="dxa"/>
+              <w:right w:w="120" w:type="dxa"/>
+            </w:tcMar>
+          </w:tcPr>
+          <w:p>
+            <w:pPr>
+              <w:spacing w:after="0" w:line="276" w:lineRule="auto"/>
+            </w:pPr>
+            <w:r>
+              <w:rPr>
+                <w:rFonts w:ascii="Arial" w:hAnsi="Arial"/>
+                <w:b/>
+                <w:color w:val="18181B"/>
+                <w:sz w:val="18"/>
+              </w:rPr>
+              <w:t>Phase 11: Authentic Moroccan Clinical Practice Dataset</w:t>
+              <w:br/>
+              <w:t>(backend:db, docker:postgres, docker:minio)</w:t>
+            </w:r>
+          </w:p>
+        </w:tc>
+        <w:tc>
+          <w:tcPr>
+            <w:tcW w:type="dxa" w:w="1584"/>
+            <w:shd w:fill="FFFFFF"/>
+            <w:tcMar>
+              <w:top w:w="90" w:type="dxa"/>
+              <w:bottom w:w="90" w:type="dxa"/>
+              <w:left w:w="120" w:type="dxa"/>
+              <w:right w:w="120" w:type="dxa"/>
+            </w:tcMar>
+          </w:tcPr>
+          <w:p>
+            <w:pPr>
+              <w:spacing w:after="0" w:line="276" w:lineRule="auto"/>
+            </w:pPr>
+            <w:r>
+              <w:rPr>
+                <w:rFonts w:ascii="Arial" w:hAnsi="Arial"/>
+                <w:color w:val="3F3F46"/>
+                <w:sz w:val="18"/>
+              </w:rPr>
+              <w:t>October 2026</w:t>
+            </w:r>
+          </w:p>
+        </w:tc>
+        <w:tc>
+          <w:tcPr>
+            <w:tcW w:type="dxa" w:w="1296"/>
+            <w:shd w:fill="FFFFFF"/>
+            <w:tcMar>
+              <w:top w:w="90" w:type="dxa"/>
+              <w:bottom w:w="90" w:type="dxa"/>
+              <w:left w:w="120" w:type="dxa"/>
+              <w:right w:w="120" w:type="dxa"/>
+            </w:tcMar>
+          </w:tcPr>
+          <w:p>
+            <w:pPr>
+              <w:spacing w:after="0" w:line="276" w:lineRule="auto"/>
+            </w:pPr>
+            <w:r>
+              <w:rPr>
+                <w:rFonts w:ascii="Arial" w:hAnsi="Arial"/>
+                <w:color w:val="3F3F46"/>
+                <w:sz w:val="18"/>
+              </w:rPr>
+              <w:t>V10</w:t>
+            </w:r>
+          </w:p>
+        </w:tc>
+        <w:tc>
+          <w:tcPr>
+            <w:tcW w:type="dxa" w:w="3888"/>
+            <w:shd w:fill="FFFFFF"/>
+            <w:tcMar>
+              <w:top w:w="90" w:type="dxa"/>
+              <w:bottom w:w="90" w:type="dxa"/>
+              <w:left w:w="120" w:type="dxa"/>
+              <w:right w:w="120" w:type="dxa"/>
+            </w:tcMar>
+          </w:tcPr>
+          <w:p>
+            <w:pPr>
+              <w:spacing w:after="0" w:line="276" w:lineRule="auto"/>
+            </w:pPr>
+            <w:r>
+              <w:rPr>
+                <w:rFonts w:ascii="Arial" w:hAnsi="Arial"/>
+                <w:color w:val="3F3F46"/>
+                <w:sz w:val="18"/>
+              </w:rPr>
+              <w:t>Full clinical lifecycle dataset for Clinique Ibn Sina Agadir: 10 Moroccan patients with authentic identities (CIN, CNSS/CNOPS, E.164 phone numbers), dynamic agenda queue with real-time waiting room FIFO tracking, completed consultations with vitals and Moroccan drug prescriptions, active daily caisse ledger in MAD across cash/TPE/cheque, diagnostic requests, sick-leave certificates, and vault documents with MinIO binary objects.</w:t>
+            </w:r>
+          </w:p>
+        </w:tc>
+      </w:tr>
     </w:tbl>
     <w:sectPr>
       <w:pgSz w:w="12240" w:h="15840"/>

</xml_diff>

<commit_message>
feat: add french voice scribe, patient history drawer, and realistic vault medical binaries
</commit_message>
<xml_diff>
--- a/docs/Dossia_Architecture_Master_Spec.docx
+++ b/docs/Dossia_Architecture_Master_Spec.docx
@@ -161,7 +161,7 @@
                 <w:color w:val="3F3F46"/>
                 <w:sz w:val="18"/>
               </w:rPr>
-              <w:t>October 14, 2026</w:t>
+              <w:t>October 15, 2026</w:t>
             </w:r>
           </w:p>
         </w:tc>
@@ -1809,7 +1809,7 @@
           <w:color w:val="059669"/>
           <w:sz w:val="25"/>
         </w:rPr>
-        <w:t>Clinical Speed Engine, Drug Catalog &amp; Document Generators (com.dossia.backend.consultation)</w:t>
+        <w:t>Clinical Speed Engine, Drug Catalog, Voice Scribe &amp; Document Generators (com.dossia.backend.consultation)</w:t>
       </w:r>
     </w:p>
     <w:p>
@@ -1822,7 +1822,7 @@
           <w:color w:val="3F3F46"/>
           <w:sz w:val="20"/>
         </w:rPr>
-        <w:t>Empowers physicians with sub-minute consultations: Moroccan drug catalog (28 pre-seeded medications), custom ordonnance templates, biological/radiological diagnostic requests, certified sick-leave certificates, and vector OpenPDF generators.</w:t>
+        <w:t>Empowers physicians with sub-minute consultations: French Medical Voice-to-Form Scribe (Dictée Vocale Clinique) with CNDP Zero-PII audio streaming, Moroccan drug catalog (28 pre-seeded medications with fuzzy matching), custom ordonnance templates, biological/radiological diagnostic requests, certified sick-leave certificates, and vector OpenPDF generators.</w:t>
       </w:r>
     </w:p>
     <w:p>
@@ -1844,7 +1844,7 @@
           <w:color w:val="3F3F46"/>
           <w:sz w:val="20"/>
         </w:rPr>
-        <w:t>consultations, prescriptions, prescription_items, medications_catalog, prescription_templates, diagnostic_requests, medical_certificates</w:t>
+        <w:t>consultations, prescriptions, prescription_items, medications_catalog, prescription_templates, diagnostic_requests, medical_certificates, ai_scribe_logs</w:t>
       </w:r>
     </w:p>
     <w:p>
@@ -1888,7 +1888,7 @@
           <w:color w:val="3F3F46"/>
           <w:sz w:val="20"/>
         </w:rPr>
-        <w:t>ConsultationService, ClinicalSpeedEngineService, OrdonnancePdfGenerator, BilanPdfGenerator, CertificatPdfGenerator, FrenchNumberSpellout</w:t>
+        <w:t>ConsultationService, ClinicalSpeedEngineService, FrenchMedicalVoiceScribeService, OrdonnancePdfGenerator, BilanPdfGenerator, CertificatPdfGenerator, FrenchNumberSpellout</w:t>
       </w:r>
     </w:p>
     <w:p>
@@ -3378,6 +3378,111 @@
           </w:p>
         </w:tc>
       </w:tr>
+      <w:tr>
+        <w:tc>
+          <w:tcPr>
+            <w:tcW w:type="dxa" w:w="2592"/>
+            <w:shd w:fill="FFFFFF"/>
+            <w:tcMar>
+              <w:top w:w="80" w:type="dxa"/>
+              <w:bottom w:w="80" w:type="dxa"/>
+              <w:left w:w="100" w:type="dxa"/>
+              <w:right w:w="100" w:type="dxa"/>
+            </w:tcMar>
+          </w:tcPr>
+          <w:p>
+            <w:pPr>
+              <w:spacing w:after="0" w:line="264" w:lineRule="auto"/>
+            </w:pPr>
+            <w:r>
+              <w:rPr>
+                <w:rFonts w:ascii="Arial" w:hAnsi="Arial"/>
+                <w:b/>
+                <w:color w:val="18181B"/>
+                <w:sz w:val="17"/>
+              </w:rPr>
+              <w:t>V11</w:t>
+              <w:br/>
+              <w:t>V11__init_voice_scribe_audit_schema.sql</w:t>
+            </w:r>
+          </w:p>
+        </w:tc>
+        <w:tc>
+          <w:tcPr>
+            <w:tcW w:type="dxa" w:w="2160"/>
+            <w:shd w:fill="FFFFFF"/>
+            <w:tcMar>
+              <w:top w:w="80" w:type="dxa"/>
+              <w:bottom w:w="80" w:type="dxa"/>
+              <w:left w:w="100" w:type="dxa"/>
+              <w:right w:w="100" w:type="dxa"/>
+            </w:tcMar>
+          </w:tcPr>
+          <w:p>
+            <w:pPr>
+              <w:spacing w:after="0" w:line="264" w:lineRule="auto"/>
+            </w:pPr>
+            <w:r>
+              <w:rPr>
+                <w:rFonts w:ascii="Arial" w:hAnsi="Arial"/>
+                <w:color w:val="3F3F46"/>
+                <w:sz w:val="17"/>
+              </w:rPr>
+              <w:t>ai_scribe_logs</w:t>
+            </w:r>
+          </w:p>
+        </w:tc>
+        <w:tc>
+          <w:tcPr>
+            <w:tcW w:type="dxa" w:w="1440"/>
+            <w:shd w:fill="FFFFFF"/>
+            <w:tcMar>
+              <w:top w:w="80" w:type="dxa"/>
+              <w:bottom w:w="80" w:type="dxa"/>
+              <w:left w:w="100" w:type="dxa"/>
+              <w:right w:w="100" w:type="dxa"/>
+            </w:tcMar>
+          </w:tcPr>
+          <w:p>
+            <w:pPr>
+              <w:spacing w:after="0" w:line="264" w:lineRule="auto"/>
+            </w:pPr>
+            <w:r>
+              <w:rPr>
+                <w:rFonts w:ascii="Arial" w:hAnsi="Arial"/>
+                <w:color w:val="3F3F46"/>
+                <w:sz w:val="17"/>
+              </w:rPr>
+              <w:t>Yes (Foreign key clinic_id)</w:t>
+            </w:r>
+          </w:p>
+        </w:tc>
+        <w:tc>
+          <w:tcPr>
+            <w:tcW w:type="dxa" w:w="3168"/>
+            <w:shd w:fill="FFFFFF"/>
+            <w:tcMar>
+              <w:top w:w="80" w:type="dxa"/>
+              <w:bottom w:w="80" w:type="dxa"/>
+              <w:left w:w="100" w:type="dxa"/>
+              <w:right w:w="100" w:type="dxa"/>
+            </w:tcMar>
+          </w:tcPr>
+          <w:p>
+            <w:pPr>
+              <w:spacing w:after="0" w:line="264" w:lineRule="auto"/>
+            </w:pPr>
+            <w:r>
+              <w:rPr>
+                <w:rFonts w:ascii="Arial" w:hAnsi="Arial"/>
+                <w:color w:val="3F3F46"/>
+                <w:sz w:val="17"/>
+              </w:rPr>
+              <w:t>Medical voice scribe audit &amp; latency log schema: CNDP Loi 09-08 compliance, zero raw audio storage, execution duration, and JSONB extraction schema.</w:t>
+            </w:r>
+          </w:p>
+        </w:tc>
+      </w:tr>
     </w:tbl>
     <w:p>
       <w:pPr>
@@ -3409,7 +3514,7 @@
           <w:color w:val="3F3F46"/>
           <w:sz w:val="20"/>
         </w:rPr>
-        <w:t>The Dossia platform exposes 46 production endpoints adhering to RESTful conventions and RFC 7807 ProblemDetail error responses.</w:t>
+        <w:t>The Dossia platform exposes 47 production endpoints adhering to RESTful conventions and RFC 7807 ProblemDetail error responses.</w:t>
       </w:r>
     </w:p>
     <w:tbl>
@@ -6812,7 +6917,7 @@
                 <w:color w:val="18181B"/>
                 <w:sz w:val="16"/>
               </w:rPr>
-              <w:t>/api/v1/billing/invoices</w:t>
+              <w:t>/api/v1/consultations/voice-scribe/fr</w:t>
             </w:r>
           </w:p>
         </w:tc>
@@ -6837,7 +6942,7 @@
                 <w:color w:val="3F3F46"/>
                 <w:sz w:val="16"/>
               </w:rPr>
-              <w:t>SECRETARY, DOCTOR</w:t>
+              <w:t>DOCTOR</w:t>
             </w:r>
           </w:p>
         </w:tc>
@@ -6862,7 +6967,7 @@
                 <w:color w:val="3F3F46"/>
                 <w:sz w:val="16"/>
               </w:rPr>
-              <w:t>Creates a consultation invoice with strict MAD BigDecimal totals.</w:t>
+              <w:t>Streams French medical voice dictation (multipart audio/webm &lt;= 5MB); transcribes and auto-populates consultation vitals and Moroccan drug catalog.</w:t>
             </w:r>
           </w:p>
         </w:tc>
@@ -6916,7 +7021,7 @@
                 <w:color w:val="18181B"/>
                 <w:sz w:val="16"/>
               </w:rPr>
-              <w:t>/api/v1/billing/payments</w:t>
+              <w:t>/api/v1/billing/invoices</w:t>
             </w:r>
           </w:p>
         </w:tc>
@@ -6966,7 +7071,7 @@
                 <w:color w:val="3F3F46"/>
                 <w:sz w:val="16"/>
               </w:rPr>
-              <w:t>Registers a payment installment with specified payment method.</w:t>
+              <w:t>Creates a consultation invoice with strict MAD BigDecimal totals.</w:t>
             </w:r>
           </w:p>
         </w:tc>
@@ -7020,7 +7125,7 @@
                 <w:color w:val="18181B"/>
                 <w:sz w:val="16"/>
               </w:rPr>
-              <w:t>/api/v1/billing/direct-encaissement</w:t>
+              <w:t>/api/v1/billing/payments</w:t>
             </w:r>
           </w:p>
         </w:tc>
@@ -7070,7 +7175,7 @@
                 <w:color w:val="3F3F46"/>
                 <w:sz w:val="16"/>
               </w:rPr>
-              <w:t>One-click invoice creation and instant payment settlement in MAD.</w:t>
+              <w:t>Registers a payment installment with specified payment method.</w:t>
             </w:r>
           </w:p>
         </w:tc>
@@ -7095,10 +7200,10 @@
               <w:rPr>
                 <w:rFonts w:ascii="Arial" w:hAnsi="Arial"/>
                 <w:b/>
-                <w:color w:val="059669"/>
+                <w:color w:val="2563EB"/>
                 <w:sz w:val="16"/>
               </w:rPr>
-              <w:t>GET</w:t>
+              <w:t>POST</w:t>
             </w:r>
           </w:p>
         </w:tc>
@@ -7124,7 +7229,7 @@
                 <w:color w:val="18181B"/>
                 <w:sz w:val="16"/>
               </w:rPr>
-              <w:t>/api/v1/billing/ledger</w:t>
+              <w:t>/api/v1/billing/direct-encaissement</w:t>
             </w:r>
           </w:p>
         </w:tc>
@@ -7174,7 +7279,7 @@
                 <w:color w:val="3F3F46"/>
                 <w:sz w:val="16"/>
               </w:rPr>
-              <w:t>Returns daily Caisse journalière totals categorized by payment method.</w:t>
+              <w:t>One-click invoice creation and instant payment settlement in MAD.</w:t>
             </w:r>
           </w:p>
         </w:tc>
@@ -7228,7 +7333,7 @@
                 <w:color w:val="18181B"/>
                 <w:sz w:val="16"/>
               </w:rPr>
-              <w:t>/api/v1/billing/invoices/{id}</w:t>
+              <w:t>/api/v1/billing/ledger</w:t>
             </w:r>
           </w:p>
         </w:tc>
@@ -7278,7 +7383,7 @@
                 <w:color w:val="3F3F46"/>
                 <w:sz w:val="16"/>
               </w:rPr>
-              <w:t>Retrieves invoice details, line items, and payment history.</w:t>
+              <w:t>Returns daily Caisse journalière totals categorized by payment method.</w:t>
             </w:r>
           </w:p>
         </w:tc>
@@ -7332,7 +7437,7 @@
                 <w:color w:val="18181B"/>
                 <w:sz w:val="16"/>
               </w:rPr>
-              <w:t>/api/v1/billing/invoices/{id}/receipt</w:t>
+              <w:t>/api/v1/billing/invoices/{id}</w:t>
             </w:r>
           </w:p>
         </w:tc>
@@ -7382,7 +7487,7 @@
                 <w:color w:val="3F3F46"/>
                 <w:sz w:val="16"/>
               </w:rPr>
-              <w:t>Generates branded OpenPDF payment receipt in Moroccan Dirhams.</w:t>
+              <w:t>Retrieves invoice details, line items, and payment history.</w:t>
             </w:r>
           </w:p>
         </w:tc>
@@ -7436,7 +7541,7 @@
                 <w:color w:val="18181B"/>
                 <w:sz w:val="16"/>
               </w:rPr>
-              <w:t>/api/v1/billing/invoices/pending</w:t>
+              <w:t>/api/v1/billing/invoices/{id}/receipt</w:t>
             </w:r>
           </w:p>
         </w:tc>
@@ -7486,7 +7591,7 @@
                 <w:color w:val="3F3F46"/>
                 <w:sz w:val="16"/>
               </w:rPr>
-              <w:t>Lists outstanding unpaid or partially paid patient invoices.</w:t>
+              <w:t>Generates branded OpenPDF payment receipt in Moroccan Dirhams.</w:t>
             </w:r>
           </w:p>
         </w:tc>
@@ -7511,10 +7616,10 @@
               <w:rPr>
                 <w:rFonts w:ascii="Arial" w:hAnsi="Arial"/>
                 <w:b/>
-                <w:color w:val="2563EB"/>
+                <w:color w:val="059669"/>
                 <w:sz w:val="16"/>
               </w:rPr>
-              <w:t>POST</w:t>
+              <w:t>GET</w:t>
             </w:r>
           </w:p>
         </w:tc>
@@ -7540,7 +7645,7 @@
                 <w:color w:val="18181B"/>
                 <w:sz w:val="16"/>
               </w:rPr>
-              <w:t>/api/v1/cnss/generate</w:t>
+              <w:t>/api/v1/billing/invoices/pending</w:t>
             </w:r>
           </w:p>
         </w:tc>
@@ -7590,7 +7695,7 @@
                 <w:color w:val="3F3F46"/>
                 <w:sz w:val="16"/>
               </w:rPr>
-              <w:t>Generates official Feuille de Soins record with AMO act codes.</w:t>
+              <w:t>Lists outstanding unpaid or partially paid patient invoices.</w:t>
             </w:r>
           </w:p>
         </w:tc>
@@ -7615,10 +7720,10 @@
               <w:rPr>
                 <w:rFonts w:ascii="Arial" w:hAnsi="Arial"/>
                 <w:b/>
-                <w:color w:val="059669"/>
+                <w:color w:val="2563EB"/>
                 <w:sz w:val="16"/>
               </w:rPr>
-              <w:t>GET</w:t>
+              <w:t>POST</w:t>
             </w:r>
           </w:p>
         </w:tc>
@@ -7644,7 +7749,7 @@
                 <w:color w:val="18181B"/>
                 <w:sz w:val="16"/>
               </w:rPr>
-              <w:t>/api/v1/cnss/{id}/pdf</w:t>
+              <w:t>/api/v1/cnss/generate</w:t>
             </w:r>
           </w:p>
         </w:tc>
@@ -7694,7 +7799,7 @@
                 <w:color w:val="3F3F46"/>
                 <w:sz w:val="16"/>
               </w:rPr>
-              <w:t>Renders printable OpenPDF Feuille de Soins (FIP-1 compliant layout).</w:t>
+              <w:t>Generates official Feuille de Soins record with AMO act codes.</w:t>
             </w:r>
           </w:p>
         </w:tc>
@@ -7748,7 +7853,7 @@
                 <w:color w:val="18181B"/>
                 <w:sz w:val="16"/>
               </w:rPr>
-              <w:t>/api/v1/cnss/patient/{patientId}</w:t>
+              <w:t>/api/v1/cnss/{id}/pdf</w:t>
             </w:r>
           </w:p>
         </w:tc>
@@ -7798,7 +7903,7 @@
                 <w:color w:val="3F3F46"/>
                 <w:sz w:val="16"/>
               </w:rPr>
-              <w:t>Retrieves all insurance claim forms generated for a patient.</w:t>
+              <w:t>Renders printable OpenPDF Feuille de Soins (FIP-1 compliant layout).</w:t>
             </w:r>
           </w:p>
         </w:tc>
@@ -7823,10 +7928,10 @@
               <w:rPr>
                 <w:rFonts w:ascii="Arial" w:hAnsi="Arial"/>
                 <w:b/>
-                <w:color w:val="D97706"/>
+                <w:color w:val="059669"/>
                 <w:sz w:val="16"/>
               </w:rPr>
-              <w:t>PATCH</w:t>
+              <w:t>GET</w:t>
             </w:r>
           </w:p>
         </w:tc>
@@ -7852,7 +7957,7 @@
                 <w:color w:val="18181B"/>
                 <w:sz w:val="16"/>
               </w:rPr>
-              <w:t>/api/v1/cnss/{id}/printed</w:t>
+              <w:t>/api/v1/cnss/patient/{patientId}</w:t>
             </w:r>
           </w:p>
         </w:tc>
@@ -7902,7 +8007,7 @@
                 <w:color w:val="3F3F46"/>
                 <w:sz w:val="16"/>
               </w:rPr>
-              <w:t>Marks a Feuille de Soins status as PRINTED for audit tracking.</w:t>
+              <w:t>Retrieves all insurance claim forms generated for a patient.</w:t>
             </w:r>
           </w:p>
         </w:tc>
@@ -7927,10 +8032,10 @@
               <w:rPr>
                 <w:rFonts w:ascii="Arial" w:hAnsi="Arial"/>
                 <w:b/>
-                <w:color w:val="2563EB"/>
+                <w:color w:val="D97706"/>
                 <w:sz w:val="16"/>
               </w:rPr>
-              <w:t>POST</w:t>
+              <w:t>PATCH</w:t>
             </w:r>
           </w:p>
         </w:tc>
@@ -7956,7 +8061,7 @@
                 <w:color w:val="18181B"/>
                 <w:sz w:val="16"/>
               </w:rPr>
-              <w:t>/api/v1/documents/upload</w:t>
+              <w:t>/api/v1/cnss/{id}/printed</w:t>
             </w:r>
           </w:p>
         </w:tc>
@@ -7981,7 +8086,7 @@
                 <w:color w:val="3F3F46"/>
                 <w:sz w:val="16"/>
               </w:rPr>
-              <w:t>DOCTOR, SECRETARY</w:t>
+              <w:t>SECRETARY, DOCTOR</w:t>
             </w:r>
           </w:p>
         </w:tc>
@@ -8006,7 +8111,7 @@
                 <w:color w:val="3F3F46"/>
                 <w:sz w:val="16"/>
               </w:rPr>
-              <w:t>Uploads medical imaging or administrative scan to MinIO vault with automatic CNDP visibility assignment.</w:t>
+              <w:t>Marks a Feuille de Soins status as PRINTED for audit tracking.</w:t>
             </w:r>
           </w:p>
         </w:tc>
@@ -8031,10 +8136,10 @@
               <w:rPr>
                 <w:rFonts w:ascii="Arial" w:hAnsi="Arial"/>
                 <w:b/>
-                <w:color w:val="059669"/>
+                <w:color w:val="2563EB"/>
                 <w:sz w:val="16"/>
               </w:rPr>
-              <w:t>GET</w:t>
+              <w:t>POST</w:t>
             </w:r>
           </w:p>
         </w:tc>
@@ -8060,7 +8165,7 @@
                 <w:color w:val="18181B"/>
                 <w:sz w:val="16"/>
               </w:rPr>
-              <w:t>/api/v1/documents/patient/{patientId}</w:t>
+              <w:t>/api/v1/documents/upload</w:t>
             </w:r>
           </w:p>
         </w:tc>
@@ -8110,7 +8215,7 @@
                 <w:color w:val="3F3F46"/>
                 <w:sz w:val="16"/>
               </w:rPr>
-              <w:t>Retrieves patient document directory filtered by role (Secretaries see only SHARED_SECRETARY).</w:t>
+              <w:t>Uploads medical imaging or administrative scan to MinIO vault with automatic CNDP visibility assignment.</w:t>
             </w:r>
           </w:p>
         </w:tc>
@@ -8164,7 +8269,7 @@
                 <w:color w:val="18181B"/>
                 <w:sz w:val="16"/>
               </w:rPr>
-              <w:t>/api/v1/documents/{id}/stream</w:t>
+              <w:t>/api/v1/documents/patient/{patientId}</w:t>
             </w:r>
           </w:p>
         </w:tc>
@@ -8214,7 +8319,7 @@
                 <w:color w:val="3F3F46"/>
                 <w:sz w:val="16"/>
               </w:rPr>
-              <w:t>Streams binary file with Content-Disposition: inline (Secretaries blocked with 403 on DOCTOR_ONLY).</w:t>
+              <w:t>Retrieves patient document directory filtered by role (Secretaries see only SHARED_SECRETARY).</w:t>
             </w:r>
           </w:p>
         </w:tc>
@@ -8239,10 +8344,10 @@
               <w:rPr>
                 <w:rFonts w:ascii="Arial" w:hAnsi="Arial"/>
                 <w:b/>
-                <w:color w:val="DC2626"/>
+                <w:color w:val="059669"/>
                 <w:sz w:val="16"/>
               </w:rPr>
-              <w:t>DELETE</w:t>
+              <w:t>GET</w:t>
             </w:r>
           </w:p>
         </w:tc>
@@ -8268,7 +8373,7 @@
                 <w:color w:val="18181B"/>
                 <w:sz w:val="16"/>
               </w:rPr>
-              <w:t>/api/v1/documents/{id}</w:t>
+              <w:t>/api/v1/documents/{id}/stream</w:t>
             </w:r>
           </w:p>
         </w:tc>
@@ -8301,6 +8406,110 @@
           <w:tcPr>
             <w:tcW w:type="dxa" w:w="2880"/>
             <w:shd w:fill="F8FAFC"/>
+            <w:tcMar>
+              <w:top w:w="70" w:type="dxa"/>
+              <w:bottom w:w="70" w:type="dxa"/>
+              <w:left w:w="90" w:type="dxa"/>
+              <w:right w:w="90" w:type="dxa"/>
+            </w:tcMar>
+          </w:tcPr>
+          <w:p>
+            <w:pPr>
+              <w:spacing w:after="0" w:line="252" w:lineRule="auto"/>
+            </w:pPr>
+            <w:r>
+              <w:rPr>
+                <w:rFonts w:ascii="Arial" w:hAnsi="Arial"/>
+                <w:color w:val="3F3F46"/>
+                <w:sz w:val="16"/>
+              </w:rPr>
+              <w:t>Streams binary file with Content-Disposition: inline (Secretaries blocked with 403 on DOCTOR_ONLY).</w:t>
+            </w:r>
+          </w:p>
+        </w:tc>
+      </w:tr>
+      <w:tr>
+        <w:tc>
+          <w:tcPr>
+            <w:tcW w:type="dxa" w:w="1152"/>
+            <w:shd w:fill="FFFFFF"/>
+            <w:tcMar>
+              <w:top w:w="70" w:type="dxa"/>
+              <w:bottom w:w="70" w:type="dxa"/>
+              <w:left w:w="90" w:type="dxa"/>
+              <w:right w:w="90" w:type="dxa"/>
+            </w:tcMar>
+          </w:tcPr>
+          <w:p>
+            <w:pPr>
+              <w:spacing w:after="0" w:line="252" w:lineRule="auto"/>
+            </w:pPr>
+            <w:r>
+              <w:rPr>
+                <w:rFonts w:ascii="Arial" w:hAnsi="Arial"/>
+                <w:b/>
+                <w:color w:val="DC2626"/>
+                <w:sz w:val="16"/>
+              </w:rPr>
+              <w:t>DELETE</w:t>
+            </w:r>
+          </w:p>
+        </w:tc>
+        <w:tc>
+          <w:tcPr>
+            <w:tcW w:type="dxa" w:w="3456"/>
+            <w:shd w:fill="FFFFFF"/>
+            <w:tcMar>
+              <w:top w:w="70" w:type="dxa"/>
+              <w:bottom w:w="70" w:type="dxa"/>
+              <w:left w:w="90" w:type="dxa"/>
+              <w:right w:w="90" w:type="dxa"/>
+            </w:tcMar>
+          </w:tcPr>
+          <w:p>
+            <w:pPr>
+              <w:spacing w:after="0" w:line="252" w:lineRule="auto"/>
+            </w:pPr>
+            <w:r>
+              <w:rPr>
+                <w:rFonts w:ascii="Arial" w:hAnsi="Arial"/>
+                <w:b/>
+                <w:color w:val="18181B"/>
+                <w:sz w:val="16"/>
+              </w:rPr>
+              <w:t>/api/v1/documents/{id}</w:t>
+            </w:r>
+          </w:p>
+        </w:tc>
+        <w:tc>
+          <w:tcPr>
+            <w:tcW w:type="dxa" w:w="1872"/>
+            <w:shd w:fill="FFFFFF"/>
+            <w:tcMar>
+              <w:top w:w="70" w:type="dxa"/>
+              <w:bottom w:w="70" w:type="dxa"/>
+              <w:left w:w="90" w:type="dxa"/>
+              <w:right w:w="90" w:type="dxa"/>
+            </w:tcMar>
+          </w:tcPr>
+          <w:p>
+            <w:pPr>
+              <w:spacing w:after="0" w:line="252" w:lineRule="auto"/>
+            </w:pPr>
+            <w:r>
+              <w:rPr>
+                <w:rFonts w:ascii="Arial" w:hAnsi="Arial"/>
+                <w:color w:val="3F3F46"/>
+                <w:sz w:val="16"/>
+              </w:rPr>
+              <w:t>DOCTOR, SECRETARY</w:t>
+            </w:r>
+          </w:p>
+        </w:tc>
+        <w:tc>
+          <w:tcPr>
+            <w:tcW w:type="dxa" w:w="2880"/>
+            <w:shd w:fill="FFFFFF"/>
             <w:tcMar>
               <w:top w:w="70" w:type="dxa"/>
               <w:bottom w:w="70" w:type="dxa"/>
@@ -8667,7 +8876,7 @@
                 <w:color w:val="3F3F46"/>
                 <w:sz w:val="18"/>
               </w:rPr>
-              <w:t>Clinical Speed Engine, OpenPDF Viewer, Tabbed Clinical Panels</w:t>
+              <w:t>Clinical Speed Engine, VoiceScribeBar, Web Audio API, OpenPDF Viewer, Tabbed Clinical Panels</w:t>
             </w:r>
           </w:p>
         </w:tc>
@@ -8692,7 +8901,7 @@
                 <w:color w:val="3F3F46"/>
                 <w:sz w:val="18"/>
               </w:rPr>
-              <w:t>Physician cockpit with Doctor Pager CTA, sub-minute ordonnance generation with Moroccan drug search, one-click template insertion, diagnostic requests, and sick-leave certificates.</w:t>
+              <w:t>Physician cockpit with Doctor Pager CTA, French Medical Voice Scribe (Alt+R, live audio waveform, CNDP zero-PII audio streaming, 3-second emerald ring validation), sub-minute ordonnance generation with Moroccan drug search, one-click template insertion, diagnostic requests, and sick-leave certificates.</w:t>
             </w:r>
           </w:p>
         </w:tc>
@@ -10169,6 +10378,321 @@
                 <w:sz w:val="18"/>
               </w:rPr>
               <w:t>Full clinical lifecycle dataset for Clinique Ibn Sina Agadir: 10 Moroccan patients with authentic identities (CIN, CNSS/CNOPS, E.164 phone numbers), dynamic agenda queue with real-time waiting room FIFO tracking, completed consultations with vitals and Moroccan drug prescriptions, active daily caisse ledger in MAD across cash/TPE/cheque, diagnostic requests, sick-leave certificates, and vault documents with MinIO binary objects.</w:t>
+            </w:r>
+          </w:p>
+        </w:tc>
+      </w:tr>
+      <w:tr>
+        <w:tc>
+          <w:tcPr>
+            <w:tcW w:type="dxa" w:w="2592"/>
+            <w:shd w:fill="F8FAFC"/>
+            <w:tcMar>
+              <w:top w:w="90" w:type="dxa"/>
+              <w:bottom w:w="90" w:type="dxa"/>
+              <w:left w:w="120" w:type="dxa"/>
+              <w:right w:w="120" w:type="dxa"/>
+            </w:tcMar>
+          </w:tcPr>
+          <w:p>
+            <w:pPr>
+              <w:spacing w:after="0" w:line="276" w:lineRule="auto"/>
+            </w:pPr>
+            <w:r>
+              <w:rPr>
+                <w:rFonts w:ascii="Arial" w:hAnsi="Arial"/>
+                <w:b/>
+                <w:color w:val="18181B"/>
+                <w:sz w:val="18"/>
+              </w:rPr>
+              <w:t>Phase 12: French Medical Voice-to-Form Scribe (Dictée Vocale Clinique)</w:t>
+              <w:br/>
+              <w:t>(backend:consultation, frontend:consultation, db:flyway)</w:t>
+            </w:r>
+          </w:p>
+        </w:tc>
+        <w:tc>
+          <w:tcPr>
+            <w:tcW w:type="dxa" w:w="1584"/>
+            <w:shd w:fill="F8FAFC"/>
+            <w:tcMar>
+              <w:top w:w="90" w:type="dxa"/>
+              <w:bottom w:w="90" w:type="dxa"/>
+              <w:left w:w="120" w:type="dxa"/>
+              <w:right w:w="120" w:type="dxa"/>
+            </w:tcMar>
+          </w:tcPr>
+          <w:p>
+            <w:pPr>
+              <w:spacing w:after="0" w:line="276" w:lineRule="auto"/>
+            </w:pPr>
+            <w:r>
+              <w:rPr>
+                <w:rFonts w:ascii="Arial" w:hAnsi="Arial"/>
+                <w:color w:val="3F3F46"/>
+                <w:sz w:val="18"/>
+              </w:rPr>
+              <w:t>October 2026</w:t>
+            </w:r>
+          </w:p>
+        </w:tc>
+        <w:tc>
+          <w:tcPr>
+            <w:tcW w:type="dxa" w:w="1296"/>
+            <w:shd w:fill="F8FAFC"/>
+            <w:tcMar>
+              <w:top w:w="90" w:type="dxa"/>
+              <w:bottom w:w="90" w:type="dxa"/>
+              <w:left w:w="120" w:type="dxa"/>
+              <w:right w:w="120" w:type="dxa"/>
+            </w:tcMar>
+          </w:tcPr>
+          <w:p>
+            <w:pPr>
+              <w:spacing w:after="0" w:line="276" w:lineRule="auto"/>
+            </w:pPr>
+            <w:r>
+              <w:rPr>
+                <w:rFonts w:ascii="Arial" w:hAnsi="Arial"/>
+                <w:color w:val="3F3F46"/>
+                <w:sz w:val="18"/>
+              </w:rPr>
+              <w:t>V11</w:t>
+            </w:r>
+          </w:p>
+        </w:tc>
+        <w:tc>
+          <w:tcPr>
+            <w:tcW w:type="dxa" w:w="3888"/>
+            <w:shd w:fill="F8FAFC"/>
+            <w:tcMar>
+              <w:top w:w="90" w:type="dxa"/>
+              <w:bottom w:w="90" w:type="dxa"/>
+              <w:left w:w="120" w:type="dxa"/>
+              <w:right w:w="120" w:type="dxa"/>
+            </w:tcMar>
+          </w:tcPr>
+          <w:p>
+            <w:pPr>
+              <w:spacing w:after="0" w:line="276" w:lineRule="auto"/>
+            </w:pPr>
+            <w:r>
+              <w:rPr>
+                <w:rFonts w:ascii="Arial" w:hAnsi="Arial"/>
+                <w:color w:val="3F3F46"/>
+                <w:sz w:val="18"/>
+              </w:rPr>
+              <w:t>Implemented French Medical Voice-to-Form Scribe: CNDP Loi 09-08 Zero-PII audio processing, native browser Web Speech API (fr-FR) with real-time speech preview badge, 60s dedicated client timeout with 30s global default, backend RestClient with 15s connect / 50s read timeouts, multi-model AI resilience fallback pipeline (gpt-5.6-luna -&gt; gemini-3.7-flash -&gt; deepseek-v4-flash-0731) on Radox AI gateway (https://radoxai.com/v1), OpenAI JSON-mode structured extraction, Moroccan drug catalog matching (Inexium, Spasfon, Augmentin, etc.), VoiceScribeBar equalizer, and reactive auto-fill with emerald ring highlights.</w:t>
+            </w:r>
+          </w:p>
+        </w:tc>
+      </w:tr>
+      <w:tr>
+        <w:tc>
+          <w:tcPr>
+            <w:tcW w:type="dxa" w:w="2592"/>
+            <w:shd w:fill="FFFFFF"/>
+            <w:tcMar>
+              <w:top w:w="90" w:type="dxa"/>
+              <w:bottom w:w="90" w:type="dxa"/>
+              <w:left w:w="120" w:type="dxa"/>
+              <w:right w:w="120" w:type="dxa"/>
+            </w:tcMar>
+          </w:tcPr>
+          <w:p>
+            <w:pPr>
+              <w:spacing w:after="0" w:line="276" w:lineRule="auto"/>
+            </w:pPr>
+            <w:r>
+              <w:rPr>
+                <w:rFonts w:ascii="Arial" w:hAnsi="Arial"/>
+                <w:b/>
+                <w:color w:val="18181B"/>
+                <w:sz w:val="18"/>
+              </w:rPr>
+              <w:t>Phase 13: Patient Medical History Timeline &amp; 1-Click Prescription Renewal</w:t>
+              <w:br/>
+              <w:t>(frontend:consultation, frontend:patients)</w:t>
+            </w:r>
+          </w:p>
+        </w:tc>
+        <w:tc>
+          <w:tcPr>
+            <w:tcW w:type="dxa" w:w="1584"/>
+            <w:shd w:fill="FFFFFF"/>
+            <w:tcMar>
+              <w:top w:w="90" w:type="dxa"/>
+              <w:bottom w:w="90" w:type="dxa"/>
+              <w:left w:w="120" w:type="dxa"/>
+              <w:right w:w="120" w:type="dxa"/>
+            </w:tcMar>
+          </w:tcPr>
+          <w:p>
+            <w:pPr>
+              <w:spacing w:after="0" w:line="276" w:lineRule="auto"/>
+            </w:pPr>
+            <w:r>
+              <w:rPr>
+                <w:rFonts w:ascii="Arial" w:hAnsi="Arial"/>
+                <w:color w:val="3F3F46"/>
+                <w:sz w:val="18"/>
+              </w:rPr>
+              <w:t>October 2026</w:t>
+            </w:r>
+          </w:p>
+        </w:tc>
+        <w:tc>
+          <w:tcPr>
+            <w:tcW w:type="dxa" w:w="1296"/>
+            <w:shd w:fill="FFFFFF"/>
+            <w:tcMar>
+              <w:top w:w="90" w:type="dxa"/>
+              <w:bottom w:w="90" w:type="dxa"/>
+              <w:left w:w="120" w:type="dxa"/>
+              <w:right w:w="120" w:type="dxa"/>
+            </w:tcMar>
+          </w:tcPr>
+          <w:p>
+            <w:pPr>
+              <w:spacing w:after="0" w:line="276" w:lineRule="auto"/>
+            </w:pPr>
+            <w:r>
+              <w:rPr>
+                <w:rFonts w:ascii="Arial" w:hAnsi="Arial"/>
+                <w:color w:val="3F3F46"/>
+                <w:sz w:val="18"/>
+              </w:rPr>
+              <w:t>N/A (Full Schema &amp; API Re-use)</w:t>
+            </w:r>
+          </w:p>
+        </w:tc>
+        <w:tc>
+          <w:tcPr>
+            <w:tcW w:type="dxa" w:w="3888"/>
+            <w:shd w:fill="FFFFFF"/>
+            <w:tcMar>
+              <w:top w:w="90" w:type="dxa"/>
+              <w:bottom w:w="90" w:type="dxa"/>
+              <w:left w:w="120" w:type="dxa"/>
+              <w:right w:w="120" w:type="dxa"/>
+            </w:tcMar>
+          </w:tcPr>
+          <w:p>
+            <w:pPr>
+              <w:spacing w:after="0" w:line="276" w:lineRule="auto"/>
+            </w:pPr>
+            <w:r>
+              <w:rPr>
+                <w:rFonts w:ascii="Arial" w:hAnsi="Arial"/>
+                <w:color w:val="3F3F46"/>
+                <w:sz w:val="18"/>
+              </w:rPr>
+              <w:t>Implemented interactive Patient Medical History Timeline (PatientMedicalHistoryModal) wired to GET /api/v1/consultations/patient/{id}. Accessible via 1-click on the Patients table (/app/patients) and directly in the ConsultationWorkspace (/app/consultations). Features vital signs summary (TA, Poids, Pouls), chronological expandable cards with diagnoses and full Moroccan prescriptions, instant OpenPDF prescription reprint, and 1-click renewal injecting historical treatments into the active consultation form with 3-second emerald ring feedback.</w:t>
+            </w:r>
+          </w:p>
+        </w:tc>
+      </w:tr>
+      <w:tr>
+        <w:tc>
+          <w:tcPr>
+            <w:tcW w:type="dxa" w:w="2592"/>
+            <w:shd w:fill="F8FAFC"/>
+            <w:tcMar>
+              <w:top w:w="90" w:type="dxa"/>
+              <w:bottom w:w="90" w:type="dxa"/>
+              <w:left w:w="120" w:type="dxa"/>
+              <w:right w:w="120" w:type="dxa"/>
+            </w:tcMar>
+          </w:tcPr>
+          <w:p>
+            <w:pPr>
+              <w:spacing w:after="0" w:line="276" w:lineRule="auto"/>
+            </w:pPr>
+            <w:r>
+              <w:rPr>
+                <w:rFonts w:ascii="Arial" w:hAnsi="Arial"/>
+                <w:b/>
+                <w:color w:val="18181B"/>
+                <w:sz w:val="18"/>
+              </w:rPr>
+              <w:t>Phase 14: Vault Realistic Binary Generation &amp; High-Fidelity Medical Assets</w:t>
+              <w:br/>
+              <w:t>(backend:vault, docker:minio, frontend:vault, scripts)</w:t>
+            </w:r>
+          </w:p>
+        </w:tc>
+        <w:tc>
+          <w:tcPr>
+            <w:tcW w:type="dxa" w:w="1584"/>
+            <w:shd w:fill="F8FAFC"/>
+            <w:tcMar>
+              <w:top w:w="90" w:type="dxa"/>
+              <w:bottom w:w="90" w:type="dxa"/>
+              <w:left w:w="120" w:type="dxa"/>
+              <w:right w:w="120" w:type="dxa"/>
+            </w:tcMar>
+          </w:tcPr>
+          <w:p>
+            <w:pPr>
+              <w:spacing w:after="0" w:line="276" w:lineRule="auto"/>
+            </w:pPr>
+            <w:r>
+              <w:rPr>
+                <w:rFonts w:ascii="Arial" w:hAnsi="Arial"/>
+                <w:color w:val="3F3F46"/>
+                <w:sz w:val="18"/>
+              </w:rPr>
+              <w:t>October 2026</w:t>
+            </w:r>
+          </w:p>
+        </w:tc>
+        <w:tc>
+          <w:tcPr>
+            <w:tcW w:type="dxa" w:w="1296"/>
+            <w:shd w:fill="F8FAFC"/>
+            <w:tcMar>
+              <w:top w:w="90" w:type="dxa"/>
+              <w:bottom w:w="90" w:type="dxa"/>
+              <w:left w:w="120" w:type="dxa"/>
+              <w:right w:w="120" w:type="dxa"/>
+            </w:tcMar>
+          </w:tcPr>
+          <w:p>
+            <w:pPr>
+              <w:spacing w:after="0" w:line="276" w:lineRule="auto"/>
+            </w:pPr>
+            <w:r>
+              <w:rPr>
+                <w:rFonts w:ascii="Arial" w:hAnsi="Arial"/>
+                <w:color w:val="3F3F46"/>
+                <w:sz w:val="18"/>
+              </w:rPr>
+              <w:t>V10 (Updated byte lengths)</w:t>
+            </w:r>
+          </w:p>
+        </w:tc>
+        <w:tc>
+          <w:tcPr>
+            <w:tcW w:type="dxa" w:w="3888"/>
+            <w:shd w:fill="F8FAFC"/>
+            <w:tcMar>
+              <w:top w:w="90" w:type="dxa"/>
+              <w:bottom w:w="90" w:type="dxa"/>
+              <w:left w:w="120" w:type="dxa"/>
+              <w:right w:w="120" w:type="dxa"/>
+            </w:tcMar>
+          </w:tcPr>
+          <w:p>
+            <w:pPr>
+              <w:spacing w:after="0" w:line="276" w:lineRule="auto"/>
+            </w:pPr>
+            <w:r>
+              <w:rPr>
+                <w:rFonts w:ascii="Arial" w:hAnsi="Arial"/>
+                <w:color w:val="3F3F46"/>
+                <w:sz w:val="18"/>
+              </w:rPr>
+              <w:t>Replaced placeholder 44-byte mock seed files in MinIO with genuine, renderable binary assets: authentic Moroccan CNOPS/AMO Attestation d'Adhésion PDF with kingdom header and coverage table, laboratory biology panel PDF, grayscale abdominal ultrasound scan PNG with acoustic speckle and hepatic calipers, and lumbar spine X-ray radiograph JPEG. Synchronized PostgreSQL patient_documents file_size_bytes ledger and polished frontend vault size formatters with dynamic Ko/Mo/bytes unit precision.</w:t>
             </w:r>
           </w:p>
         </w:tc>

</xml_diff>

<commit_message>
add new skills for agents
</commit_message>
<xml_diff>
--- a/docs/Dossia_Architecture_Master_Spec.docx
+++ b/docs/Dossia_Architecture_Master_Spec.docx
@@ -697,7 +697,7 @@
                 <w:color w:val="3F3F46"/>
                 <w:sz w:val="18"/>
               </w:rPr>
-              <w:t>React 18, TypeScript, Vite, Tailwind CSS v4, Zustand, Lucide, Three.js</w:t>
+              <w:t>React 18, TypeScript, Vite, Tailwind CSS v4, Zustand, Lucide, Three.js, Taste-Skill (design-taste-frontend)</w:t>
             </w:r>
           </w:p>
         </w:tc>
@@ -722,7 +722,7 @@
                 <w:color w:val="3F3F46"/>
                 <w:sz w:val="18"/>
               </w:rPr>
-              <w:t>High-density clinical web application featuring role-based workspaces, real-time SSE listener, command palette, and interactive 3D landing network.</w:t>
+              <w:t>High-density clinical web application featuring role-based workspaces, real-time SSE listener, command palette, interactive 3D landing network, and Leonxlnx/taste-skill Dual-Mode Dials (Landing vs Dashboard Hardening).</w:t>
             </w:r>
           </w:p>
         </w:tc>
@@ -8668,7 +8668,7 @@
           <w:color w:val="3F3F46"/>
           <w:sz w:val="20"/>
         </w:rPr>
-        <w:t>The Dossia frontend is structured into dedicated, role-gated workspaces. Each workspace adheres to the 'Secretary-First' high-density design system defined in skill 01-premium-ui-craft.md.</w:t>
+        <w:t>The Dossia frontend is structured into dedicated, role-gated workspaces built on React 18, Vite, and Tailwind CSS v4. The frontend enforces Leonxlnx/taste-skill (design-taste-frontend) alongside the 'Secretary-First' high-density design system (skill 01-premium-ui-craft.md). The architecture operates under Dual-Mode Dials: public marketing pages leverage high visual variance and motion (DESIGN_VARIANCE=7, MOTION_INTENSITY=6, VISUAL_DENSITY=4), while clinical and financial workspaces operate in Dashboard Hardening mode (DESIGN_VARIANCE=3, MOTION_INTENSITY=3, VISUAL_DENSITY=9) banning bloated containers in favor of structural divide-y layouts, hairline zinc borders, tabular-nums font-mono arithmetic in MAD, and emerald accents.</w:t>
       </w:r>
     </w:p>
     <w:tbl>
@@ -8821,7 +8821,7 @@
                 <w:color w:val="3F3F46"/>
                 <w:sz w:val="18"/>
               </w:rPr>
-              <w:t>Three.js Canvas, Lucide React, Tailwind CSS v4</w:t>
+              <w:t>Three.js Canvas, Lucide React, Tailwind CSS v4, Taste-Skill (Public Mode: DESIGN_VARIANCE=7, MOTION_INTENSITY=6, VISUAL_DENSITY=4)</w:t>
             </w:r>
           </w:p>
         </w:tc>
@@ -8846,7 +8846,7 @@
                 <w:color w:val="3F3F46"/>
                 <w:sz w:val="18"/>
               </w:rPr>
-              <w:t>Interactive showcase featuring a dynamic 3D medical network visualization and a live Moroccan clinic financial ROI calculator in MAD.</w:t>
+              <w:t>Interactive showcase featuring dynamic 3D medical network visualization, live Moroccan clinic financial ROI calculator in MAD, asymmetric hero compositions, Geist/Satoshi typography, and spring physics adhering to anti-slop art direction.</w:t>
             </w:r>
           </w:p>
         </w:tc>
@@ -8901,7 +8901,7 @@
                 <w:color w:val="3F3F46"/>
                 <w:sz w:val="18"/>
               </w:rPr>
-              <w:t>Zustand, TanStack Query, Radix UI Dialog, Global Command Palette</w:t>
+              <w:t>Zustand, TanStack Query, Radix UI Dialog, Global Command Palette, Taste-Skill (Dashboard Hardening: DENSITY=9)</w:t>
             </w:r>
           </w:p>
         </w:tc>
@@ -8926,7 +8926,7 @@
                 <w:color w:val="3F3F46"/>
                 <w:sz w:val="18"/>
               </w:rPr>
-              <w:t>High-density reception dashboard engineered for the 3-second SLA. Features real-time waiting room FIFO display, instant walk-in check-in, fast slot booking, and quick direct encaissement.</w:t>
+              <w:t>High-density reception dashboard engineered for the 3-second SLA. Enforces Dashboard Hardening mode: ban bloated card containers in favor of structural divide-y, hairline zinc borders, real-time waiting room FIFO display, instant walk-in check-in, fast slot booking, and quick direct encaissement.</w:t>
             </w:r>
           </w:p>
         </w:tc>
@@ -8981,7 +8981,7 @@
                 <w:color w:val="3F3F46"/>
                 <w:sz w:val="18"/>
               </w:rPr>
-              <w:t>Clinical Speed Engine, VoiceScribeBar, Web Audio API, OpenPDF Viewer, Tabbed Clinical Panels</w:t>
+              <w:t>Clinical Speed Engine, VoiceScribeBar, Web Audio API, OpenPDF Viewer, Tabbed Clinical Panels, Taste-Skill (Dashboard Hardening: DENSITY=9)</w:t>
             </w:r>
           </w:p>
         </w:tc>
@@ -9061,7 +9061,7 @@
                 <w:color w:val="3F3F46"/>
                 <w:sz w:val="18"/>
               </w:rPr>
-              <w:t>Lucide React, Tabular Mono Font, OpenPDF Receipt Generator</w:t>
+              <w:t>Lucide React, Tabular Mono Font, OpenPDF Receipt Generator, Taste-Skill (Dashboard Hardening: DENSITY=9)</w:t>
             </w:r>
           </w:p>
         </w:tc>
@@ -9086,7 +9086,7 @@
                 <w:color w:val="3F3F46"/>
                 <w:sz w:val="18"/>
               </w:rPr>
-              <w:t>Financial register view displaying real-time daily cash, TPE card, cheque, and transfer totals in MAD with one-click receipt printing.</w:t>
+              <w:t>Financial register view displaying real-time daily cash, TPE card, cheque, and transfer totals in MAD with strict tabular-nums font-mono typography and one-click receipt printing.</w:t>
             </w:r>
           </w:p>
         </w:tc>
@@ -9141,7 +9141,7 @@
                 <w:color w:val="3F3F46"/>
                 <w:sz w:val="18"/>
               </w:rPr>
-              <w:t>AdminLayout, ProtectedRoute, RoleGuard, CNDP Audit Table</w:t>
+              <w:t>AdminLayout, ProtectedRoute, RoleGuard, CNDP Audit Table, Taste-Skill (Dashboard Hardening: DENSITY=9)</w:t>
             </w:r>
           </w:p>
         </w:tc>
@@ -11008,6 +11008,111 @@
                 <w:sz w:val="18"/>
               </w:rPr>
               <w:t>Resolved Voice Scribe timeout issue where cloud LLMs with reasoning took 20-35s while socket readTimeout was prematurely set to 12s, causing forced fallback to empty mock data. Extended backend readTimeout to 55s (connectTimeout 10s) and frontend Axios timeout to 75s. Configured ultra-fast minimax-m3 (11.8s latency) with fallback chain (qwen3.8-27b, deepseek-v4-flash-0731). Hardened system prompt and regexes to handle speech-to-text acoustic artifacts ('en sur 7' -&gt; 11/7, 'pulses 80' -&gt; 80 bpm, 'erius 5000 g' -&gt; Aerius 5mg, 'prix malin' -&gt; Primalan). Seeded Flyway V12 with Primalan into Moroccan Drug Catalog and preloaded 'Urticaire Aiguë Adulte' 1-click prescription template.</w:t>
+            </w:r>
+          </w:p>
+        </w:tc>
+      </w:tr>
+      <w:tr>
+        <w:tc>
+          <w:tcPr>
+            <w:tcW w:type="dxa" w:w="2592"/>
+            <w:shd w:fill="FFFFFF"/>
+            <w:tcMar>
+              <w:top w:w="90" w:type="dxa"/>
+              <w:bottom w:w="90" w:type="dxa"/>
+              <w:left w:w="120" w:type="dxa"/>
+              <w:right w:w="120" w:type="dxa"/>
+            </w:tcMar>
+          </w:tcPr>
+          <w:p>
+            <w:pPr>
+              <w:spacing w:after="0" w:line="276" w:lineRule="auto"/>
+            </w:pPr>
+            <w:r>
+              <w:rPr>
+                <w:rFonts w:ascii="Arial" w:hAnsi="Arial"/>
+                <w:b/>
+                <w:color w:val="18181B"/>
+                <w:sz w:val="18"/>
+              </w:rPr>
+              <w:t>Phase 17: Frontend Design System Hardening &amp; Taste-Skill Integration</w:t>
+              <w:br/>
+              <w:t>(frontend, skills:01-premium-ui-craft, agents)</w:t>
+            </w:r>
+          </w:p>
+        </w:tc>
+        <w:tc>
+          <w:tcPr>
+            <w:tcW w:type="dxa" w:w="1584"/>
+            <w:shd w:fill="FFFFFF"/>
+            <w:tcMar>
+              <w:top w:w="90" w:type="dxa"/>
+              <w:bottom w:w="90" w:type="dxa"/>
+              <w:left w:w="120" w:type="dxa"/>
+              <w:right w:w="120" w:type="dxa"/>
+            </w:tcMar>
+          </w:tcPr>
+          <w:p>
+            <w:pPr>
+              <w:spacing w:after="0" w:line="276" w:lineRule="auto"/>
+            </w:pPr>
+            <w:r>
+              <w:rPr>
+                <w:rFonts w:ascii="Arial" w:hAnsi="Arial"/>
+                <w:color w:val="3F3F46"/>
+                <w:sz w:val="18"/>
+              </w:rPr>
+              <w:t>October 2026</w:t>
+            </w:r>
+          </w:p>
+        </w:tc>
+        <w:tc>
+          <w:tcPr>
+            <w:tcW w:type="dxa" w:w="1296"/>
+            <w:shd w:fill="FFFFFF"/>
+            <w:tcMar>
+              <w:top w:w="90" w:type="dxa"/>
+              <w:bottom w:w="90" w:type="dxa"/>
+              <w:left w:w="120" w:type="dxa"/>
+              <w:right w:w="120" w:type="dxa"/>
+            </w:tcMar>
+          </w:tcPr>
+          <w:p>
+            <w:pPr>
+              <w:spacing w:after="0" w:line="276" w:lineRule="auto"/>
+            </w:pPr>
+            <w:r>
+              <w:rPr>
+                <w:rFonts w:ascii="Arial" w:hAnsi="Arial"/>
+                <w:color w:val="3F3F46"/>
+                <w:sz w:val="18"/>
+              </w:rPr>
+              <w:t>N/A (Frontend Governance &amp; Taste-Skill)</w:t>
+            </w:r>
+          </w:p>
+        </w:tc>
+        <w:tc>
+          <w:tcPr>
+            <w:tcW w:type="dxa" w:w="3888"/>
+            <w:shd w:fill="FFFFFF"/>
+            <w:tcMar>
+              <w:top w:w="90" w:type="dxa"/>
+              <w:bottom w:w="90" w:type="dxa"/>
+              <w:left w:w="120" w:type="dxa"/>
+              <w:right w:w="120" w:type="dxa"/>
+            </w:tcMar>
+          </w:tcPr>
+          <w:p>
+            <w:pPr>
+              <w:spacing w:after="0" w:line="276" w:lineRule="auto"/>
+            </w:pPr>
+            <w:r>
+              <w:rPr>
+                <w:rFonts w:ascii="Arial" w:hAnsi="Arial"/>
+                <w:color w:val="3F3F46"/>
+                <w:sz w:val="18"/>
+              </w:rPr>
+              <w:t>Integrated Leonxlnx/taste-skill (design-taste-frontend) into Dossia frontend architecture and agent governance. Established Dual-Mode Dials: Public Landing (DESIGN_VARIANCE=7, MOTION_INTENSITY=6, VISUAL_DENSITY=4 with asymmetric compositions, Geist/Satoshi typography, and spring physics) vs. Clinical/Financial Workspaces (DESIGN_VARIANCE=3, MOTION_INTENSITY=3, VISUAL_DENSITY=9 Dashboard Hardening mode with structural divide-y, hairline zinc borders, strict tabular-nums font-mono MAD arithmetic, and emerald #059669 accents). Enforced React 18 + Vite SPA stack constraint (ignoring Next.js 'use client' rules).</w:t>
             </w:r>
           </w:p>
         </w:tc>

</xml_diff>